<commit_message>
testing knitr - table references not working but knits otherwise
</commit_message>
<xml_diff>
--- a/_book/techreport.docx
+++ b/_book/techreport.docx
@@ -43,8 +43,48 @@
                 <w:sz w:val="36"/>
                 <w:szCs w:val="36"/>
                 <w:lang w:val="fr-CA"/>
+                <w:rFonts w:ascii="Microsoft Sans Serif" w:hAnsi="Microsoft Sans Serif" w:cs="Microsoft Sans Serif"/>
+                <w:b/>
+                <w:bCs/>
+                <w:sz w:val="36"/>
+                <w:szCs w:val="36"/>
+                <w:lang w:val="fr-CA"/>
+              </w:rPr>
+              <w:t xml:space="preserve"/>
+            </w:r>
+            <w:r>
+              <w:rPr>
+                <w:rFonts w:ascii="Microsoft Sans Serif" w:hAnsi="Microsoft Sans Serif" w:cs="Microsoft Sans Serif"/>
+                <w:b/>
+                <w:bCs/>
+                <w:sz w:val="36"/>
+                <w:szCs w:val="36"/>
+                <w:lang w:val="fr-CA"/>
+                <w:rFonts w:ascii="Microsoft Sans Serif" w:hAnsi="Microsoft Sans Serif" w:cs="Microsoft Sans Serif"/>
+                <w:b/>
+                <w:bCs/>
+                <w:sz w:val="36"/>
+                <w:szCs w:val="36"/>
+                <w:lang w:val="fr-CA"/>
               </w:rPr>
               <w:t xml:space="preserve">Updated Escapement Estimate Type Classification Guidance</w:t>
+            </w:r>
+            <w:r>
+              <w:rPr>
+                <w:rFonts w:ascii="Microsoft Sans Serif" w:hAnsi="Microsoft Sans Serif" w:cs="Microsoft Sans Serif"/>
+                <w:b/>
+                <w:bCs/>
+                <w:sz w:val="36"/>
+                <w:szCs w:val="36"/>
+                <w:lang w:val="fr-CA"/>
+                <w:rFonts w:ascii="Microsoft Sans Serif" w:hAnsi="Microsoft Sans Serif" w:cs="Microsoft Sans Serif"/>
+                <w:b/>
+                <w:bCs/>
+                <w:sz w:val="36"/>
+                <w:szCs w:val="36"/>
+                <w:lang w:val="fr-CA"/>
+              </w:rPr>
+              <w:t xml:space="preserve"/>
             </w:r>
             <w:bookmarkEnd w:id="0"/>
             <w:permEnd w:id="1097994225"/>
@@ -74,8 +114,33 @@
                 <w:rFonts w:ascii="Microsoft Sans Serif" w:hAnsi="Microsoft Sans Serif" w:cs="Microsoft Sans Serif"/>
                 <w:sz w:val="28"/>
                 <w:szCs w:val="28"/>
+                <w:rFonts w:ascii="Microsoft Sans Serif" w:hAnsi="Microsoft Sans Serif" w:cs="Microsoft Sans Serif"/>
+                <w:sz w:val="28"/>
+                <w:szCs w:val="28"/>
+              </w:rPr>
+              <w:t xml:space="preserve"/>
+            </w:r>
+            <w:r>
+              <w:rPr>
+                <w:rFonts w:ascii="Microsoft Sans Serif" w:hAnsi="Microsoft Sans Serif" w:cs="Microsoft Sans Serif"/>
+                <w:sz w:val="28"/>
+                <w:szCs w:val="28"/>
+                <w:rFonts w:ascii="Microsoft Sans Serif" w:hAnsi="Microsoft Sans Serif" w:cs="Microsoft Sans Serif"/>
+                <w:sz w:val="28"/>
+                <w:szCs w:val="28"/>
               </w:rPr>
               <w:t xml:space="preserve">Brett Johnson, Isabella Borea, Michael Arbeider, Marissa Glavas, Brian Smith, Nicholas Brown, Erika Anderson, Regional Escapement Data Task Team</w:t>
+            </w:r>
+            <w:r>
+              <w:rPr>
+                <w:rFonts w:ascii="Microsoft Sans Serif" w:hAnsi="Microsoft Sans Serif" w:cs="Microsoft Sans Serif"/>
+                <w:sz w:val="28"/>
+                <w:szCs w:val="28"/>
+                <w:rFonts w:ascii="Microsoft Sans Serif" w:hAnsi="Microsoft Sans Serif" w:cs="Microsoft Sans Serif"/>
+                <w:sz w:val="28"/>
+                <w:szCs w:val="28"/>
+              </w:rPr>
+              <w:t xml:space="preserve"/>
             </w:r>
             <w:bookmarkEnd w:id="1"/>
             <w:permEnd w:id="1925973081"/>
@@ -106,12 +171,29 @@
                 <w:sz w:val="28"/>
                 <w:szCs w:val="28"/>
                 <w:lang w:val="fr-CA"/>
+                <w:rFonts w:ascii="Microsoft Sans Serif" w:hAnsi="Microsoft Sans Serif" w:cs="Microsoft Sans Serif"/>
+                <w:sz w:val="28"/>
+                <w:szCs w:val="28"/>
+                <w:lang w:val="fr-CA"/>
+              </w:rPr>
+              <w:t xml:space="preserve"/>
+            </w:r>
+            <w:r>
+              <w:rPr>
+                <w:rFonts w:ascii="Microsoft Sans Serif" w:hAnsi="Microsoft Sans Serif" w:cs="Microsoft Sans Serif"/>
+                <w:sz w:val="28"/>
+                <w:szCs w:val="28"/>
+                <w:lang w:val="fr-CA"/>
                 <w:vertAlign w:val="superscript"/>
               </w:rPr>
               <w:t xml:space="preserve">1</w:t>
             </w:r>
             <w:r>
               <w:rPr>
+                <w:rFonts w:ascii="Microsoft Sans Serif" w:hAnsi="Microsoft Sans Serif" w:cs="Microsoft Sans Serif"/>
+                <w:sz w:val="28"/>
+                <w:szCs w:val="28"/>
+                <w:lang w:val="fr-CA"/>
                 <w:rFonts w:ascii="Microsoft Sans Serif" w:hAnsi="Microsoft Sans Serif" w:cs="Microsoft Sans Serif"/>
                 <w:sz w:val="28"/>
                 <w:szCs w:val="28"/>
@@ -125,11 +207,19 @@
                 <w:sz w:val="28"/>
                 <w:szCs w:val="28"/>
                 <w:lang w:val="fr-CA"/>
+                <w:rFonts w:ascii="Microsoft Sans Serif" w:hAnsi="Microsoft Sans Serif" w:cs="Microsoft Sans Serif"/>
+                <w:sz w:val="28"/>
+                <w:szCs w:val="28"/>
+                <w:lang w:val="fr-CA"/>
               </w:rPr>
               <w:br/>
             </w:r>
             <w:r>
               <w:rPr>
+                <w:rFonts w:ascii="Microsoft Sans Serif" w:hAnsi="Microsoft Sans Serif" w:cs="Microsoft Sans Serif"/>
+                <w:sz w:val="28"/>
+                <w:szCs w:val="28"/>
+                <w:lang w:val="fr-CA"/>
                 <w:rFonts w:ascii="Microsoft Sans Serif" w:hAnsi="Microsoft Sans Serif" w:cs="Microsoft Sans Serif"/>
                 <w:sz w:val="28"/>
                 <w:szCs w:val="28"/>
@@ -143,6 +233,10 @@
                 <w:sz w:val="28"/>
                 <w:szCs w:val="28"/>
                 <w:lang w:val="fr-CA"/>
+                <w:rFonts w:ascii="Microsoft Sans Serif" w:hAnsi="Microsoft Sans Serif" w:cs="Microsoft Sans Serif"/>
+                <w:sz w:val="28"/>
+                <w:szCs w:val="28"/>
+                <w:lang w:val="fr-CA"/>
               </w:rPr>
               <w:br/>
             </w:r>
@@ -152,8 +246,25 @@
                 <w:sz w:val="28"/>
                 <w:szCs w:val="28"/>
                 <w:lang w:val="fr-CA"/>
+                <w:rFonts w:ascii="Microsoft Sans Serif" w:hAnsi="Microsoft Sans Serif" w:cs="Microsoft Sans Serif"/>
+                <w:sz w:val="28"/>
+                <w:szCs w:val="28"/>
+                <w:lang w:val="fr-CA"/>
               </w:rPr>
               <w:t xml:space="preserve">Nanaimo, British Columbia, V9T 6N7, Canada</w:t>
+            </w:r>
+            <w:r>
+              <w:rPr>
+                <w:rFonts w:ascii="Microsoft Sans Serif" w:hAnsi="Microsoft Sans Serif" w:cs="Microsoft Sans Serif"/>
+                <w:sz w:val="28"/>
+                <w:szCs w:val="28"/>
+                <w:lang w:val="fr-CA"/>
+                <w:rFonts w:ascii="Microsoft Sans Serif" w:hAnsi="Microsoft Sans Serif" w:cs="Microsoft Sans Serif"/>
+                <w:sz w:val="28"/>
+                <w:szCs w:val="28"/>
+                <w:lang w:val="fr-CA"/>
+              </w:rPr>
+              <w:t xml:space="preserve"/>
             </w:r>
             <w:bookmarkEnd w:id="2"/>
             <w:permEnd w:id="634062271"/>

</xml_diff>

<commit_message>
Updated year and author addresses
</commit_message>
<xml_diff>
--- a/_book/techreport.docx
+++ b/_book/techreport.docx
@@ -129,7 +129,147 @@
                 <w:sz w:val="28"/>
                 <w:szCs w:val="28"/>
               </w:rPr>
-              <w:t xml:space="preserve">Brett Johnson, Isabella Borea, Michael Arbeider, Marissa Glavas, Brian Smith, Nicholas Brown, Erika Anderson, Regional Escapement Data Task Team</w:t>
+              <w:t xml:space="preserve">Brett Johnson</w:t>
+            </w:r>
+            <w:r>
+              <w:rPr>
+                <w:rFonts w:ascii="Microsoft Sans Serif" w:hAnsi="Microsoft Sans Serif" w:cs="Microsoft Sans Serif"/>
+                <w:sz w:val="28"/>
+                <w:szCs w:val="28"/>
+                <w:vertAlign w:val="superscript"/>
+              </w:rPr>
+              <w:t xml:space="preserve">1</w:t>
+            </w:r>
+            <w:r>
+              <w:rPr>
+                <w:rFonts w:ascii="Microsoft Sans Serif" w:hAnsi="Microsoft Sans Serif" w:cs="Microsoft Sans Serif"/>
+                <w:sz w:val="28"/>
+                <w:szCs w:val="28"/>
+                <w:rFonts w:ascii="Microsoft Sans Serif" w:hAnsi="Microsoft Sans Serif" w:cs="Microsoft Sans Serif"/>
+                <w:sz w:val="28"/>
+                <w:szCs w:val="28"/>
+              </w:rPr>
+              <w:t xml:space="preserve">, Isabella Borea</w:t>
+            </w:r>
+            <w:r>
+              <w:rPr>
+                <w:rFonts w:ascii="Microsoft Sans Serif" w:hAnsi="Microsoft Sans Serif" w:cs="Microsoft Sans Serif"/>
+                <w:sz w:val="28"/>
+                <w:szCs w:val="28"/>
+                <w:vertAlign w:val="superscript"/>
+              </w:rPr>
+              <w:t xml:space="preserve">2</w:t>
+            </w:r>
+            <w:r>
+              <w:rPr>
+                <w:rFonts w:ascii="Microsoft Sans Serif" w:hAnsi="Microsoft Sans Serif" w:cs="Microsoft Sans Serif"/>
+                <w:sz w:val="28"/>
+                <w:szCs w:val="28"/>
+                <w:rFonts w:ascii="Microsoft Sans Serif" w:hAnsi="Microsoft Sans Serif" w:cs="Microsoft Sans Serif"/>
+                <w:sz w:val="28"/>
+                <w:szCs w:val="28"/>
+              </w:rPr>
+              <w:t xml:space="preserve">, Michael Arbeider</w:t>
+            </w:r>
+            <w:r>
+              <w:rPr>
+                <w:rFonts w:ascii="Microsoft Sans Serif" w:hAnsi="Microsoft Sans Serif" w:cs="Microsoft Sans Serif"/>
+                <w:sz w:val="28"/>
+                <w:szCs w:val="28"/>
+                <w:vertAlign w:val="superscript"/>
+              </w:rPr>
+              <w:t xml:space="preserve">3</w:t>
+            </w:r>
+            <w:r>
+              <w:rPr>
+                <w:rFonts w:ascii="Microsoft Sans Serif" w:hAnsi="Microsoft Sans Serif" w:cs="Microsoft Sans Serif"/>
+                <w:sz w:val="28"/>
+                <w:szCs w:val="28"/>
+                <w:rFonts w:ascii="Microsoft Sans Serif" w:hAnsi="Microsoft Sans Serif" w:cs="Microsoft Sans Serif"/>
+                <w:sz w:val="28"/>
+                <w:szCs w:val="28"/>
+              </w:rPr>
+              <w:t xml:space="preserve">, Marissa Glavas</w:t>
+            </w:r>
+            <w:r>
+              <w:rPr>
+                <w:rFonts w:ascii="Microsoft Sans Serif" w:hAnsi="Microsoft Sans Serif" w:cs="Microsoft Sans Serif"/>
+                <w:sz w:val="28"/>
+                <w:szCs w:val="28"/>
+                <w:vertAlign w:val="superscript"/>
+              </w:rPr>
+              <w:t xml:space="preserve">2</w:t>
+            </w:r>
+            <w:r>
+              <w:rPr>
+                <w:rFonts w:ascii="Microsoft Sans Serif" w:hAnsi="Microsoft Sans Serif" w:cs="Microsoft Sans Serif"/>
+                <w:sz w:val="28"/>
+                <w:szCs w:val="28"/>
+                <w:rFonts w:ascii="Microsoft Sans Serif" w:hAnsi="Microsoft Sans Serif" w:cs="Microsoft Sans Serif"/>
+                <w:sz w:val="28"/>
+                <w:szCs w:val="28"/>
+              </w:rPr>
+              <w:t xml:space="preserve">, Brian Smith</w:t>
+            </w:r>
+            <w:r>
+              <w:rPr>
+                <w:rFonts w:ascii="Microsoft Sans Serif" w:hAnsi="Microsoft Sans Serif" w:cs="Microsoft Sans Serif"/>
+                <w:sz w:val="28"/>
+                <w:szCs w:val="28"/>
+                <w:vertAlign w:val="superscript"/>
+              </w:rPr>
+              <w:t xml:space="preserve">2</w:t>
+            </w:r>
+            <w:r>
+              <w:rPr>
+                <w:rFonts w:ascii="Microsoft Sans Serif" w:hAnsi="Microsoft Sans Serif" w:cs="Microsoft Sans Serif"/>
+                <w:sz w:val="28"/>
+                <w:szCs w:val="28"/>
+                <w:rFonts w:ascii="Microsoft Sans Serif" w:hAnsi="Microsoft Sans Serif" w:cs="Microsoft Sans Serif"/>
+                <w:sz w:val="28"/>
+                <w:szCs w:val="28"/>
+              </w:rPr>
+              <w:t xml:space="preserve">, Nicholas Brown</w:t>
+            </w:r>
+            <w:r>
+              <w:rPr>
+                <w:rFonts w:ascii="Microsoft Sans Serif" w:hAnsi="Microsoft Sans Serif" w:cs="Microsoft Sans Serif"/>
+                <w:sz w:val="28"/>
+                <w:szCs w:val="28"/>
+                <w:vertAlign w:val="superscript"/>
+              </w:rPr>
+              <w:t xml:space="preserve">3</w:t>
+            </w:r>
+            <w:r>
+              <w:rPr>
+                <w:rFonts w:ascii="Microsoft Sans Serif" w:hAnsi="Microsoft Sans Serif" w:cs="Microsoft Sans Serif"/>
+                <w:sz w:val="28"/>
+                <w:szCs w:val="28"/>
+                <w:rFonts w:ascii="Microsoft Sans Serif" w:hAnsi="Microsoft Sans Serif" w:cs="Microsoft Sans Serif"/>
+                <w:sz w:val="28"/>
+                <w:szCs w:val="28"/>
+              </w:rPr>
+              <w:t xml:space="preserve">, Erika Anderson</w:t>
+            </w:r>
+            <w:r>
+              <w:rPr>
+                <w:rFonts w:ascii="Microsoft Sans Serif" w:hAnsi="Microsoft Sans Serif" w:cs="Microsoft Sans Serif"/>
+                <w:sz w:val="28"/>
+                <w:szCs w:val="28"/>
+                <w:vertAlign w:val="superscript"/>
+              </w:rPr>
+              <w:t xml:space="preserve">3</w:t>
+            </w:r>
+            <w:r>
+              <w:rPr>
+                <w:rFonts w:ascii="Microsoft Sans Serif" w:hAnsi="Microsoft Sans Serif" w:cs="Microsoft Sans Serif"/>
+                <w:sz w:val="28"/>
+                <w:szCs w:val="28"/>
+                <w:rFonts w:ascii="Microsoft Sans Serif" w:hAnsi="Microsoft Sans Serif" w:cs="Microsoft Sans Serif"/>
+                <w:sz w:val="28"/>
+                <w:szCs w:val="28"/>
+              </w:rPr>
+              <w:t xml:space="preserve">, Regional Escapement Data Task Team</w:t>
             </w:r>
             <w:r>
               <w:rPr>
@@ -199,7 +339,7 @@
                 <w:szCs w:val="28"/>
                 <w:lang w:val="fr-CA"/>
               </w:rPr>
-              <w:t xml:space="preserve">Pacific Biological Station</w:t>
+              <w:t xml:space="preserve">Pacific Salmon Commission, 600–1155 Robson Street</w:t>
             </w:r>
             <w:r>
               <w:rPr>
@@ -225,7 +365,7 @@
                 <w:szCs w:val="28"/>
                 <w:lang w:val="fr-CA"/>
               </w:rPr>
-              <w:t xml:space="preserve">Fisheries and Oceans Canada, 3190 Hammond Bay Road</w:t>
+              <w:t xml:space="preserve">Vancouver, British Columbia, V6E 1B5, Canada</w:t>
             </w:r>
             <w:r>
               <w:rPr>
@@ -246,25 +386,185 @@
                 <w:sz w:val="28"/>
                 <w:szCs w:val="28"/>
                 <w:lang w:val="fr-CA"/>
-                <w:rFonts w:ascii="Microsoft Sans Serif" w:hAnsi="Microsoft Sans Serif" w:cs="Microsoft Sans Serif"/>
-                <w:sz w:val="28"/>
-                <w:szCs w:val="28"/>
-                <w:lang w:val="fr-CA"/>
-              </w:rPr>
-              <w:t xml:space="preserve">Nanaimo, British Columbia, V9T 6N7, Canada</w:t>
-            </w:r>
-            <w:r>
-              <w:rPr>
-                <w:rFonts w:ascii="Microsoft Sans Serif" w:hAnsi="Microsoft Sans Serif" w:cs="Microsoft Sans Serif"/>
-                <w:sz w:val="28"/>
-                <w:szCs w:val="28"/>
-                <w:lang w:val="fr-CA"/>
-                <w:rFonts w:ascii="Microsoft Sans Serif" w:hAnsi="Microsoft Sans Serif" w:cs="Microsoft Sans Serif"/>
-                <w:sz w:val="28"/>
-                <w:szCs w:val="28"/>
-                <w:lang w:val="fr-CA"/>
-              </w:rPr>
-              <w:t xml:space="preserve"/>
+                <w:vertAlign w:val="superscript"/>
+              </w:rPr>
+              <w:t xml:space="preserve">2</w:t>
+            </w:r>
+            <w:r>
+              <w:rPr>
+                <w:rFonts w:ascii="Microsoft Sans Serif" w:hAnsi="Microsoft Sans Serif" w:cs="Microsoft Sans Serif"/>
+                <w:sz w:val="28"/>
+                <w:szCs w:val="28"/>
+                <w:lang w:val="fr-CA"/>
+                <w:rFonts w:ascii="Microsoft Sans Serif" w:hAnsi="Microsoft Sans Serif" w:cs="Microsoft Sans Serif"/>
+                <w:sz w:val="28"/>
+                <w:szCs w:val="28"/>
+                <w:lang w:val="fr-CA"/>
+              </w:rPr>
+              <w:t xml:space="preserve">Annacis Island, Fisheries and Oceans Canada, Unit 3</w:t>
+            </w:r>
+            <w:r>
+              <w:rPr>
+                <w:rFonts w:ascii="Microsoft Sans Serif" w:hAnsi="Microsoft Sans Serif" w:cs="Microsoft Sans Serif"/>
+                <w:sz w:val="28"/>
+                <w:szCs w:val="28"/>
+                <w:lang w:val="fr-CA"/>
+                <w:rFonts w:ascii="Microsoft Sans Serif" w:hAnsi="Microsoft Sans Serif" w:cs="Microsoft Sans Serif"/>
+                <w:sz w:val="28"/>
+                <w:szCs w:val="28"/>
+                <w:lang w:val="fr-CA"/>
+              </w:rPr>
+              <w:br/>
+            </w:r>
+            <w:r>
+              <w:rPr>
+                <w:rFonts w:ascii="Microsoft Sans Serif" w:hAnsi="Microsoft Sans Serif" w:cs="Microsoft Sans Serif"/>
+                <w:sz w:val="28"/>
+                <w:szCs w:val="28"/>
+                <w:lang w:val="fr-CA"/>
+                <w:rFonts w:ascii="Microsoft Sans Serif" w:hAnsi="Microsoft Sans Serif" w:cs="Microsoft Sans Serif"/>
+                <w:sz w:val="28"/>
+                <w:szCs w:val="28"/>
+                <w:lang w:val="fr-CA"/>
+              </w:rPr>
+              <w:t xml:space="preserve">100 Annacis Parkway, Delta, British Columbia,V3M 6A2, Canada</w:t>
+            </w:r>
+            <w:r>
+              <w:rPr>
+                <w:rFonts w:ascii="Microsoft Sans Serif" w:hAnsi="Microsoft Sans Serif" w:cs="Microsoft Sans Serif"/>
+                <w:sz w:val="28"/>
+                <w:szCs w:val="28"/>
+                <w:lang w:val="fr-CA"/>
+                <w:rFonts w:ascii="Microsoft Sans Serif" w:hAnsi="Microsoft Sans Serif" w:cs="Microsoft Sans Serif"/>
+                <w:sz w:val="28"/>
+                <w:szCs w:val="28"/>
+                <w:lang w:val="fr-CA"/>
+              </w:rPr>
+              <w:br/>
+            </w:r>
+            <w:r>
+              <w:rPr>
+                <w:rFonts w:ascii="Microsoft Sans Serif" w:hAnsi="Microsoft Sans Serif" w:cs="Microsoft Sans Serif"/>
+                <w:sz w:val="28"/>
+                <w:szCs w:val="28"/>
+                <w:lang w:val="fr-CA"/>
+                <w:vertAlign w:val="superscript"/>
+              </w:rPr>
+              <w:t xml:space="preserve">3</w:t>
+            </w:r>
+            <w:r>
+              <w:rPr>
+                <w:rFonts w:ascii="Microsoft Sans Serif" w:hAnsi="Microsoft Sans Serif" w:cs="Microsoft Sans Serif"/>
+                <w:sz w:val="28"/>
+                <w:szCs w:val="28"/>
+                <w:lang w:val="fr-CA"/>
+                <w:rFonts w:ascii="Microsoft Sans Serif" w:hAnsi="Microsoft Sans Serif" w:cs="Microsoft Sans Serif"/>
+                <w:sz w:val="28"/>
+                <w:szCs w:val="28"/>
+                <w:lang w:val="fr-CA"/>
+              </w:rPr>
+              <w:t xml:space="preserve">Kamloops Area Office,Fisheries and Oceans Canada</w:t>
+            </w:r>
+            <w:r>
+              <w:rPr>
+                <w:rFonts w:ascii="Microsoft Sans Serif" w:hAnsi="Microsoft Sans Serif" w:cs="Microsoft Sans Serif"/>
+                <w:sz w:val="28"/>
+                <w:szCs w:val="28"/>
+                <w:lang w:val="fr-CA"/>
+                <w:rFonts w:ascii="Microsoft Sans Serif" w:hAnsi="Microsoft Sans Serif" w:cs="Microsoft Sans Serif"/>
+                <w:sz w:val="28"/>
+                <w:szCs w:val="28"/>
+                <w:lang w:val="fr-CA"/>
+              </w:rPr>
+              <w:br/>
+            </w:r>
+            <w:r>
+              <w:rPr>
+                <w:rFonts w:ascii="Microsoft Sans Serif" w:hAnsi="Microsoft Sans Serif" w:cs="Microsoft Sans Serif"/>
+                <w:sz w:val="28"/>
+                <w:szCs w:val="28"/>
+                <w:lang w:val="fr-CA"/>
+                <w:rFonts w:ascii="Microsoft Sans Serif" w:hAnsi="Microsoft Sans Serif" w:cs="Microsoft Sans Serif"/>
+                <w:sz w:val="28"/>
+                <w:szCs w:val="28"/>
+                <w:lang w:val="fr-CA"/>
+              </w:rPr>
+              <w:t xml:space="preserve">985 McGill Place, Kamloops, British Columbia,V2C 6X6, Canada</w:t>
+            </w:r>
+            <w:r>
+              <w:rPr>
+                <w:rFonts w:ascii="Microsoft Sans Serif" w:hAnsi="Microsoft Sans Serif" w:cs="Microsoft Sans Serif"/>
+                <w:sz w:val="28"/>
+                <w:szCs w:val="28"/>
+                <w:lang w:val="fr-CA"/>
+                <w:rFonts w:ascii="Microsoft Sans Serif" w:hAnsi="Microsoft Sans Serif" w:cs="Microsoft Sans Serif"/>
+                <w:sz w:val="28"/>
+                <w:szCs w:val="28"/>
+                <w:lang w:val="fr-CA"/>
+              </w:rPr>
+              <w:br/>
+            </w:r>
+            <w:r>
+              <w:rPr>
+                <w:rFonts w:ascii="Microsoft Sans Serif" w:hAnsi="Microsoft Sans Serif" w:cs="Microsoft Sans Serif"/>
+                <w:sz w:val="28"/>
+                <w:szCs w:val="28"/>
+                <w:lang w:val="fr-CA"/>
+                <w:vertAlign w:val="superscript"/>
+              </w:rPr>
+              <w:t xml:space="preserve">4</w:t>
+            </w:r>
+            <w:r>
+              <w:rPr>
+                <w:rFonts w:ascii="Microsoft Sans Serif" w:hAnsi="Microsoft Sans Serif" w:cs="Microsoft Sans Serif"/>
+                <w:sz w:val="28"/>
+                <w:szCs w:val="28"/>
+                <w:lang w:val="fr-CA"/>
+                <w:rFonts w:ascii="Microsoft Sans Serif" w:hAnsi="Microsoft Sans Serif" w:cs="Microsoft Sans Serif"/>
+                <w:sz w:val="28"/>
+                <w:szCs w:val="28"/>
+                <w:lang w:val="fr-CA"/>
+              </w:rPr>
+              <w:t xml:space="preserve">Pacific Biological Station, Fisheries and Oceans Canada</w:t>
+            </w:r>
+            <w:r>
+              <w:rPr>
+                <w:rFonts w:ascii="Microsoft Sans Serif" w:hAnsi="Microsoft Sans Serif" w:cs="Microsoft Sans Serif"/>
+                <w:sz w:val="28"/>
+                <w:szCs w:val="28"/>
+                <w:lang w:val="fr-CA"/>
+                <w:rFonts w:ascii="Microsoft Sans Serif" w:hAnsi="Microsoft Sans Serif" w:cs="Microsoft Sans Serif"/>
+                <w:sz w:val="28"/>
+                <w:szCs w:val="28"/>
+                <w:lang w:val="fr-CA"/>
+              </w:rPr>
+              <w:br/>
+            </w:r>
+            <w:r>
+              <w:rPr>
+                <w:rFonts w:ascii="Microsoft Sans Serif" w:hAnsi="Microsoft Sans Serif" w:cs="Microsoft Sans Serif"/>
+                <w:sz w:val="28"/>
+                <w:szCs w:val="28"/>
+                <w:lang w:val="fr-CA"/>
+                <w:rFonts w:ascii="Microsoft Sans Serif" w:hAnsi="Microsoft Sans Serif" w:cs="Microsoft Sans Serif"/>
+                <w:sz w:val="28"/>
+                <w:szCs w:val="28"/>
+                <w:lang w:val="fr-CA"/>
+              </w:rPr>
+              <w:t xml:space="preserve">3190 Hammond Bay Road, Nanaimo, British Columbia, V9T 6N7, Canada</w:t>
+            </w:r>
+            <w:r>
+              <w:rPr>
+                <w:rFonts w:ascii="Microsoft Sans Serif" w:hAnsi="Microsoft Sans Serif" w:cs="Microsoft Sans Serif"/>
+                <w:sz w:val="28"/>
+                <w:szCs w:val="28"/>
+                <w:lang w:val="fr-CA"/>
+                <w:rFonts w:ascii="Microsoft Sans Serif" w:hAnsi="Microsoft Sans Serif" w:cs="Microsoft Sans Serif"/>
+                <w:sz w:val="28"/>
+                <w:szCs w:val="28"/>
+                <w:lang w:val="fr-CA"/>
+              </w:rPr>
+              <w:br/>
             </w:r>
             <w:bookmarkEnd w:id="2"/>
             <w:permEnd w:id="634062271"/>
@@ -299,7 +599,7 @@
                 <w:szCs w:val="28"/>
                 <w:lang w:val="fr-CA"/>
               </w:rPr>
-              <w:t>2025</w:t>
+              <w:t>2026</w:t>
             </w:r>
             <w:bookmarkEnd w:id="3"/>
             <w:permEnd w:id="2118853603"/>

</xml_diff>

<commit_message>
Remove MA from author and address list by request
</commit_message>
<xml_diff>
--- a/_book/techreport.docx
+++ b/_book/techreport.docx
@@ -169,26 +169,6 @@
                 <w:sz w:val="28"/>
                 <w:szCs w:val="28"/>
               </w:rPr>
-              <w:t xml:space="preserve">, Michael Arbeider</w:t>
-            </w:r>
-            <w:r>
-              <w:rPr>
-                <w:rFonts w:ascii="Microsoft Sans Serif" w:hAnsi="Microsoft Sans Serif" w:cs="Microsoft Sans Serif"/>
-                <w:sz w:val="28"/>
-                <w:szCs w:val="28"/>
-                <w:vertAlign w:val="superscript"/>
-              </w:rPr>
-              <w:t xml:space="preserve">3</w:t>
-            </w:r>
-            <w:r>
-              <w:rPr>
-                <w:rFonts w:ascii="Microsoft Sans Serif" w:hAnsi="Microsoft Sans Serif" w:cs="Microsoft Sans Serif"/>
-                <w:sz w:val="28"/>
-                <w:szCs w:val="28"/>
-                <w:rFonts w:ascii="Microsoft Sans Serif" w:hAnsi="Microsoft Sans Serif" w:cs="Microsoft Sans Serif"/>
-                <w:sz w:val="28"/>
-                <w:szCs w:val="28"/>
-              </w:rPr>
               <w:t xml:space="preserve">, Marissa Glavas</w:t>
             </w:r>
             <w:r>
@@ -451,68 +431,6 @@
                 <w:vertAlign w:val="superscript"/>
               </w:rPr>
               <w:t xml:space="preserve">3</w:t>
-            </w:r>
-            <w:r>
-              <w:rPr>
-                <w:rFonts w:ascii="Microsoft Sans Serif" w:hAnsi="Microsoft Sans Serif" w:cs="Microsoft Sans Serif"/>
-                <w:sz w:val="28"/>
-                <w:szCs w:val="28"/>
-                <w:lang w:val="fr-CA"/>
-                <w:rFonts w:ascii="Microsoft Sans Serif" w:hAnsi="Microsoft Sans Serif" w:cs="Microsoft Sans Serif"/>
-                <w:sz w:val="28"/>
-                <w:szCs w:val="28"/>
-                <w:lang w:val="fr-CA"/>
-              </w:rPr>
-              <w:t xml:space="preserve">Kamloops Area Office, Fisheries and Oceans Canada</w:t>
-            </w:r>
-            <w:r>
-              <w:rPr>
-                <w:rFonts w:ascii="Microsoft Sans Serif" w:hAnsi="Microsoft Sans Serif" w:cs="Microsoft Sans Serif"/>
-                <w:sz w:val="28"/>
-                <w:szCs w:val="28"/>
-                <w:lang w:val="fr-CA"/>
-                <w:rFonts w:ascii="Microsoft Sans Serif" w:hAnsi="Microsoft Sans Serif" w:cs="Microsoft Sans Serif"/>
-                <w:sz w:val="28"/>
-                <w:szCs w:val="28"/>
-                <w:lang w:val="fr-CA"/>
-              </w:rPr>
-              <w:br/>
-            </w:r>
-            <w:r>
-              <w:rPr>
-                <w:rFonts w:ascii="Microsoft Sans Serif" w:hAnsi="Microsoft Sans Serif" w:cs="Microsoft Sans Serif"/>
-                <w:sz w:val="28"/>
-                <w:szCs w:val="28"/>
-                <w:lang w:val="fr-CA"/>
-                <w:rFonts w:ascii="Microsoft Sans Serif" w:hAnsi="Microsoft Sans Serif" w:cs="Microsoft Sans Serif"/>
-                <w:sz w:val="28"/>
-                <w:szCs w:val="28"/>
-                <w:lang w:val="fr-CA"/>
-              </w:rPr>
-              <w:t xml:space="preserve">985 McGill Place, Kamloops, British Columbia,V2C 6X6, Canada</w:t>
-            </w:r>
-            <w:r>
-              <w:rPr>
-                <w:rFonts w:ascii="Microsoft Sans Serif" w:hAnsi="Microsoft Sans Serif" w:cs="Microsoft Sans Serif"/>
-                <w:sz w:val="28"/>
-                <w:szCs w:val="28"/>
-                <w:lang w:val="fr-CA"/>
-                <w:rFonts w:ascii="Microsoft Sans Serif" w:hAnsi="Microsoft Sans Serif" w:cs="Microsoft Sans Serif"/>
-                <w:sz w:val="28"/>
-                <w:szCs w:val="28"/>
-                <w:lang w:val="fr-CA"/>
-              </w:rPr>
-              <w:br/>
-            </w:r>
-            <w:r>
-              <w:rPr>
-                <w:rFonts w:ascii="Microsoft Sans Serif" w:hAnsi="Microsoft Sans Serif" w:cs="Microsoft Sans Serif"/>
-                <w:sz w:val="28"/>
-                <w:szCs w:val="28"/>
-                <w:lang w:val="fr-CA"/>
-                <w:vertAlign w:val="superscript"/>
-              </w:rPr>
-              <w:t xml:space="preserve">4</w:t>
             </w:r>
             <w:r>
               <w:rPr>

</xml_diff>